<commit_message>
feat: add the simplest time series
</commit_message>
<xml_diff>
--- a/51PM Projektuvannja modeluvannja/2/PM_KNT-122_Onyshchenko_19_PR2.docx
+++ b/51PM Projektuvannja modeluvannja/2/PM_KNT-122_Onyshchenko_19_PR2.docx
@@ -550,6 +550,60 @@
       <w:pPr>
         <w:pStyle w:val="p11"/>
         <w:ind w:hanging="0" w:left="0"/>
+        <w:rPr>
+          <w:lang w:val="uk-UA"/>
+        </w:rPr>
+      </w:pPr>
+      <w:r>
+        <w:rPr>
+          <w:lang w:val="uk-UA"/>
+        </w:rPr>
+      </w:r>
+    </w:p>
+    <w:p>
+      <w:pPr>
+        <w:pStyle w:val="h11"/>
+        <w:rPr>
+          <w:lang w:val="uk-UA"/>
+        </w:rPr>
+      </w:pPr>
+      <w:r>
+        <w:rPr>
+          <w:lang w:val="uk-UA"/>
+        </w:rPr>
+        <w:t>Виконання</w:t>
+      </w:r>
+    </w:p>
+    <w:p>
+      <w:pPr>
+        <w:pStyle w:val="p11"/>
+        <w:rPr>
+          <w:lang w:val="uk-UA"/>
+        </w:rPr>
+      </w:pPr>
+      <w:r>
+        <w:rPr>
+          <w:lang w:val="uk-UA"/>
+        </w:rPr>
+      </w:r>
+    </w:p>
+    <w:p>
+      <w:pPr>
+        <w:pStyle w:val="p11"/>
+        <w:rPr>
+          <w:lang w:val="uk-UA"/>
+        </w:rPr>
+      </w:pPr>
+      <w:r>
+        <w:rPr>
+          <w:lang w:val="uk-UA"/>
+        </w:rPr>
+        <w:t>Під час виконання була проблема: при реєстрації потрібно вказати картку, на якій було б 1 долар для верифікації. Такої картки у студента не було.</w:t>
+      </w:r>
+    </w:p>
+    <w:p>
+      <w:pPr>
+        <w:pStyle w:val="p11"/>
         <w:rPr>
           <w:lang w:val="uk-UA"/>
         </w:rPr>

</xml_diff>